<commit_message>
Working tab layout with movie about fragment
</commit_message>
<xml_diff>
--- a/Plan.docx
+++ b/Plan.docx
@@ -1,6 +1,6 @@
 
 <file path=word/document.xml><?xml version="1.0" encoding="utf-8"?>
-<w:document xmlns:wpc="http://schemas.microsoft.com/office/word/2010/wordprocessingCanvas" xmlns:mc="http://schemas.openxmlformats.org/markup-compatibility/2006" xmlns:o="urn:schemas-microsoft-com:office:office" xmlns:r="http://schemas.openxmlformats.org/officeDocument/2006/relationships" xmlns:m="http://schemas.openxmlformats.org/officeDocument/2006/math" xmlns:v="urn:schemas-microsoft-com:vml" xmlns:wp14="http://schemas.microsoft.com/office/word/2010/wordprocessingDrawing" xmlns:wp="http://schemas.openxmlformats.org/drawingml/2006/wordprocessingDrawing" xmlns:w10="urn:schemas-microsoft-com:office:word" xmlns:w="http://schemas.openxmlformats.org/wordprocessingml/2006/main" xmlns:w14="http://schemas.microsoft.com/office/word/2010/wordml" xmlns:w15="http://schemas.microsoft.com/office/word/2012/wordml" xmlns:wpg="http://schemas.microsoft.com/office/word/2010/wordprocessingGroup" xmlns:wpi="http://schemas.microsoft.com/office/word/2010/wordprocessingInk" xmlns:wne="http://schemas.microsoft.com/office/word/2006/wordml" xmlns:wps="http://schemas.microsoft.com/office/word/2010/wordprocessingShape" mc:Ignorable="w14 w15 wp14">
+<w:document xmlns:wpc="http://schemas.microsoft.com/office/word/2010/wordprocessingCanvas" xmlns:cx="http://schemas.microsoft.com/office/drawing/2014/chartex" xmlns:cx1="http://schemas.microsoft.com/office/drawing/2015/9/8/chartex" xmlns:cx2="http://schemas.microsoft.com/office/drawing/2015/10/21/chartex" xmlns:cx3="http://schemas.microsoft.com/office/drawing/2016/5/9/chartex" xmlns:cx4="http://schemas.microsoft.com/office/drawing/2016/5/10/chartex" xmlns:cx5="http://schemas.microsoft.com/office/drawing/2016/5/11/chartex" xmlns:cx6="http://schemas.microsoft.com/office/drawing/2016/5/12/chartex" xmlns:cx7="http://schemas.microsoft.com/office/drawing/2016/5/13/chartex" xmlns:cx8="http://schemas.microsoft.com/office/drawing/2016/5/14/chartex" xmlns:mc="http://schemas.openxmlformats.org/markup-compatibility/2006" xmlns:aink="http://schemas.microsoft.com/office/drawing/2016/ink" xmlns:am3d="http://schemas.microsoft.com/office/drawing/2017/model3d" xmlns:o="urn:schemas-microsoft-com:office:office" xmlns:r="http://schemas.openxmlformats.org/officeDocument/2006/relationships" xmlns:m="http://schemas.openxmlformats.org/officeDocument/2006/math" xmlns:v="urn:schemas-microsoft-com:vml" xmlns:wp14="http://schemas.microsoft.com/office/word/2010/wordprocessingDrawing" xmlns:wp="http://schemas.openxmlformats.org/drawingml/2006/wordprocessingDrawing" xmlns:w10="urn:schemas-microsoft-com:office:word" xmlns:w="http://schemas.openxmlformats.org/wordprocessingml/2006/main" xmlns:w14="http://schemas.microsoft.com/office/word/2010/wordml" xmlns:w15="http://schemas.microsoft.com/office/word/2012/wordml" xmlns:w16cid="http://schemas.microsoft.com/office/word/2016/wordml/cid" xmlns:w16se="http://schemas.microsoft.com/office/word/2015/wordml/symex" xmlns:wpg="http://schemas.microsoft.com/office/word/2010/wordprocessingGroup" xmlns:wpi="http://schemas.microsoft.com/office/word/2010/wordprocessingInk" xmlns:wne="http://schemas.microsoft.com/office/word/2006/wordml" xmlns:wps="http://schemas.microsoft.com/office/word/2010/wordprocessingShape" mc:Ignorable="w14 w15 w16se w16cid wp14">
   <w:body>
     <w:p>
       <w:r>
@@ -15,22 +15,40 @@
       <w:r>
         <w:t xml:space="preserve"> </w:t>
       </w:r>
+      <w:proofErr w:type="spellStart"/>
       <w:r>
         <w:rPr>
           <w:lang w:val="en-US"/>
         </w:rPr>
         <w:t>VideoBox</w:t>
       </w:r>
+      <w:proofErr w:type="spellEnd"/>
       <w:r>
         <w:t xml:space="preserve">. </w:t>
       </w:r>
       <w:r>
-        <w:t xml:space="preserve">Выводится список список дорам по выбору редакции. В верхней части экрана имеется тулбар, где можно </w:t>
+        <w:t xml:space="preserve">Выводится список </w:t>
+      </w:r>
+      <w:proofErr w:type="spellStart"/>
+      <w:r>
+        <w:t>список</w:t>
+      </w:r>
+      <w:proofErr w:type="spellEnd"/>
+      <w:r>
+        <w:t xml:space="preserve"> дорам по выбору редакции. В верхней части экрана имеется </w:t>
+      </w:r>
+      <w:proofErr w:type="spellStart"/>
+      <w:r>
+        <w:t>тулбар</w:t>
+      </w:r>
+      <w:proofErr w:type="spellEnd"/>
+      <w:r>
+        <w:t xml:space="preserve">, где можно </w:t>
       </w:r>
     </w:p>
     <w:p>
       <w:pPr>
-        <w:pStyle w:val="ListParagraph"/>
+        <w:pStyle w:val="a3"/>
         <w:numPr>
           <w:ilvl w:val="0"/>
           <w:numId w:val="1"/>
@@ -42,19 +60,27 @@
     </w:p>
     <w:p>
       <w:pPr>
-        <w:pStyle w:val="ListParagraph"/>
+        <w:pStyle w:val="a3"/>
         <w:numPr>
           <w:ilvl w:val="0"/>
           <w:numId w:val="1"/>
         </w:numPr>
       </w:pPr>
       <w:r>
-        <w:t>поискать нужную дораму;</w:t>
+        <w:t xml:space="preserve">поискать нужную </w:t>
+      </w:r>
+      <w:proofErr w:type="spellStart"/>
+      <w:r>
+        <w:t>дораму</w:t>
+      </w:r>
+      <w:proofErr w:type="spellEnd"/>
+      <w:r>
+        <w:t>;</w:t>
       </w:r>
     </w:p>
     <w:p>
       <w:pPr>
-        <w:pStyle w:val="ListParagraph"/>
+        <w:pStyle w:val="a3"/>
         <w:numPr>
           <w:ilvl w:val="0"/>
           <w:numId w:val="1"/>
@@ -67,33 +93,55 @@
     <w:p/>
     <w:p>
       <w:r>
-        <w:t>Процесс парсинга дорам.</w:t>
+        <w:t xml:space="preserve">Процесс </w:t>
+      </w:r>
+      <w:proofErr w:type="spellStart"/>
+      <w:r>
+        <w:t>парсинга</w:t>
+      </w:r>
+      <w:proofErr w:type="spellEnd"/>
+      <w:r>
+        <w:t xml:space="preserve"> дорам.</w:t>
       </w:r>
     </w:p>
     <w:p>
-      <w:r>
-        <w:t xml:space="preserve">Дорамы берутся с сайта </w:t>
-      </w:r>
+      <w:proofErr w:type="spellStart"/>
+      <w:r>
+        <w:t>Дорамы</w:t>
+      </w:r>
+      <w:proofErr w:type="spellEnd"/>
+      <w:r>
+        <w:t xml:space="preserve"> берутся с сайта </w:t>
+      </w:r>
+      <w:proofErr w:type="spellStart"/>
       <w:r>
         <w:rPr>
           <w:lang w:val="en-US"/>
         </w:rPr>
         <w:t>doramatv</w:t>
       </w:r>
+      <w:proofErr w:type="spellEnd"/>
       <w:r>
         <w:t>.</w:t>
       </w:r>
+      <w:proofErr w:type="spellStart"/>
       <w:r>
         <w:rPr>
           <w:lang w:val="en-US"/>
         </w:rPr>
         <w:t>ru</w:t>
       </w:r>
+      <w:proofErr w:type="spellEnd"/>
       <w:r>
         <w:t xml:space="preserve">. </w:t>
       </w:r>
-      <w:r>
-        <w:t xml:space="preserve">Парсится </w:t>
+      <w:proofErr w:type="spellStart"/>
+      <w:r>
+        <w:t>Парсится</w:t>
+      </w:r>
+      <w:proofErr w:type="spellEnd"/>
+      <w:r>
+        <w:t xml:space="preserve"> </w:t>
       </w:r>
       <w:r>
         <w:rPr>
@@ -105,7 +153,58 @@
         <w:t xml:space="preserve"> </w:t>
       </w:r>
       <w:r>
-        <w:t>код, берется название дорамы, её год, жанр и картинка. К каждой дораме из списка создается объект, которые содержит все запарсенные данные. При нажатии на одну из дорам открывается окно с её описанием. В открывшемся окне можно посмотреть описание дорамы, узнать рейтинг и почитать отзывы. На второй вкладке в том же окне можно выбрать интересующий источник для воспроизведения. Отображается ресурс (пока только вк), сабгруппа. При выборе источника предлагается выбрать качество и плеер для воспроизведения.</w:t>
+        <w:t xml:space="preserve">код, берется название </w:t>
+      </w:r>
+      <w:proofErr w:type="spellStart"/>
+      <w:r>
+        <w:t>дорамы</w:t>
+      </w:r>
+      <w:proofErr w:type="spellEnd"/>
+      <w:r>
+        <w:t xml:space="preserve">, её год, жанр и картинка. К каждой </w:t>
+      </w:r>
+      <w:proofErr w:type="spellStart"/>
+      <w:r>
+        <w:t>дораме</w:t>
+      </w:r>
+      <w:proofErr w:type="spellEnd"/>
+      <w:r>
+        <w:t xml:space="preserve"> из списка создается объект, которые содержит все </w:t>
+      </w:r>
+      <w:proofErr w:type="spellStart"/>
+      <w:r>
+        <w:t>запарсенные</w:t>
+      </w:r>
+      <w:proofErr w:type="spellEnd"/>
+      <w:r>
+        <w:t xml:space="preserve"> данные. При нажатии на одну из дорам открывается окно с её описанием. В открывшемся окне можно посмотреть описание </w:t>
+      </w:r>
+      <w:proofErr w:type="spellStart"/>
+      <w:r>
+        <w:t>дорамы</w:t>
+      </w:r>
+      <w:proofErr w:type="spellEnd"/>
+      <w:r>
+        <w:t xml:space="preserve">, узнать рейтинг и почитать отзывы. На второй вкладке в том же окне можно выбрать интересующий источник для воспроизведения. Отображается ресурс (пока только </w:t>
+      </w:r>
+      <w:proofErr w:type="spellStart"/>
+      <w:r>
+        <w:t>вк</w:t>
+      </w:r>
+      <w:proofErr w:type="spellEnd"/>
+      <w:r>
+        <w:t xml:space="preserve">), </w:t>
+      </w:r>
+      <w:proofErr w:type="spellStart"/>
+      <w:r>
+        <w:t>сабгруппа</w:t>
+      </w:r>
+      <w:proofErr w:type="spellEnd"/>
+      <w:r>
+        <w:t>. При выборе источника предлагается выбрать качество и плеер для воспроизведения.</w:t>
+      </w:r>
+      <w:r>
+        <w:t>ß</w:t>
       </w:r>
       <w:bookmarkStart w:id="0" w:name="_GoBack"/>
       <w:bookmarkEnd w:id="0"/>
@@ -121,7 +220,7 @@
 </file>
 
 <file path=word/numbering.xml><?xml version="1.0" encoding="utf-8"?>
-<w:numbering xmlns:wpc="http://schemas.microsoft.com/office/word/2010/wordprocessingCanvas" xmlns:mc="http://schemas.openxmlformats.org/markup-compatibility/2006" xmlns:o="urn:schemas-microsoft-com:office:office" xmlns:r="http://schemas.openxmlformats.org/officeDocument/2006/relationships" xmlns:m="http://schemas.openxmlformats.org/officeDocument/2006/math" xmlns:v="urn:schemas-microsoft-com:vml" xmlns:wp14="http://schemas.microsoft.com/office/word/2010/wordprocessingDrawing" xmlns:wp="http://schemas.openxmlformats.org/drawingml/2006/wordprocessingDrawing" xmlns:w10="urn:schemas-microsoft-com:office:word" xmlns:w="http://schemas.openxmlformats.org/wordprocessingml/2006/main" xmlns:w14="http://schemas.microsoft.com/office/word/2010/wordml" xmlns:w15="http://schemas.microsoft.com/office/word/2012/wordml" xmlns:wpg="http://schemas.microsoft.com/office/word/2010/wordprocessingGroup" xmlns:wpi="http://schemas.microsoft.com/office/word/2010/wordprocessingInk" xmlns:wne="http://schemas.microsoft.com/office/word/2006/wordml" xmlns:wps="http://schemas.microsoft.com/office/word/2010/wordprocessingShape" mc:Ignorable="w14 w15 wp14">
+<w:numbering xmlns:wpc="http://schemas.microsoft.com/office/word/2010/wordprocessingCanvas" xmlns:cx="http://schemas.microsoft.com/office/drawing/2014/chartex" xmlns:cx1="http://schemas.microsoft.com/office/drawing/2015/9/8/chartex" xmlns:cx2="http://schemas.microsoft.com/office/drawing/2015/10/21/chartex" xmlns:cx3="http://schemas.microsoft.com/office/drawing/2016/5/9/chartex" xmlns:cx4="http://schemas.microsoft.com/office/drawing/2016/5/10/chartex" xmlns:cx5="http://schemas.microsoft.com/office/drawing/2016/5/11/chartex" xmlns:cx6="http://schemas.microsoft.com/office/drawing/2016/5/12/chartex" xmlns:cx7="http://schemas.microsoft.com/office/drawing/2016/5/13/chartex" xmlns:cx8="http://schemas.microsoft.com/office/drawing/2016/5/14/chartex" xmlns:mc="http://schemas.openxmlformats.org/markup-compatibility/2006" xmlns:aink="http://schemas.microsoft.com/office/drawing/2016/ink" xmlns:am3d="http://schemas.microsoft.com/office/drawing/2017/model3d" xmlns:o="urn:schemas-microsoft-com:office:office" xmlns:r="http://schemas.openxmlformats.org/officeDocument/2006/relationships" xmlns:m="http://schemas.openxmlformats.org/officeDocument/2006/math" xmlns:v="urn:schemas-microsoft-com:vml" xmlns:wp14="http://schemas.microsoft.com/office/word/2010/wordprocessingDrawing" xmlns:wp="http://schemas.openxmlformats.org/drawingml/2006/wordprocessingDrawing" xmlns:w10="urn:schemas-microsoft-com:office:word" xmlns:w="http://schemas.openxmlformats.org/wordprocessingml/2006/main" xmlns:w14="http://schemas.microsoft.com/office/word/2010/wordml" xmlns:w15="http://schemas.microsoft.com/office/word/2012/wordml" xmlns:w16cid="http://schemas.microsoft.com/office/word/2016/wordml/cid" xmlns:w16se="http://schemas.microsoft.com/office/word/2015/wordml/symex" xmlns:wpg="http://schemas.microsoft.com/office/word/2010/wordprocessingGroup" xmlns:wpi="http://schemas.microsoft.com/office/word/2010/wordprocessingInk" xmlns:wne="http://schemas.microsoft.com/office/word/2006/wordml" xmlns:wps="http://schemas.microsoft.com/office/word/2010/wordprocessingShape" mc:Ignorable="w14 w15 w16se w16cid wp14">
   <w:abstractNum w:abstractNumId="0" w15:restartNumberingAfterBreak="0">
     <w:nsid w:val="2D3F0632"/>
     <w:multiLevelType w:val="hybridMultilevel"/>
@@ -242,7 +341,7 @@
 </file>
 
 <file path=word/styles.xml><?xml version="1.0" encoding="utf-8"?>
-<w:styles xmlns:mc="http://schemas.openxmlformats.org/markup-compatibility/2006" xmlns:r="http://schemas.openxmlformats.org/officeDocument/2006/relationships" xmlns:w="http://schemas.openxmlformats.org/wordprocessingml/2006/main" xmlns:w14="http://schemas.microsoft.com/office/word/2010/wordml" xmlns:w15="http://schemas.microsoft.com/office/word/2012/wordml" mc:Ignorable="w14 w15">
+<w:styles xmlns:mc="http://schemas.openxmlformats.org/markup-compatibility/2006" xmlns:r="http://schemas.openxmlformats.org/officeDocument/2006/relationships" xmlns:w="http://schemas.openxmlformats.org/wordprocessingml/2006/main" xmlns:w14="http://schemas.microsoft.com/office/word/2010/wordml" xmlns:w15="http://schemas.microsoft.com/office/word/2012/wordml" xmlns:w16cid="http://schemas.microsoft.com/office/word/2016/wordml/cid" xmlns:w16se="http://schemas.microsoft.com/office/word/2015/wordml/symex" mc:Ignorable="w14 w15 w16se w16cid">
   <w:docDefaults>
     <w:rPrDefault>
       <w:rPr>
@@ -258,7 +357,7 @@
       </w:pPr>
     </w:pPrDefault>
   </w:docDefaults>
-  <w:latentStyles w:defLockedState="0" w:defUIPriority="99" w:defSemiHidden="0" w:defUnhideWhenUsed="0" w:defQFormat="0" w:count="371">
+  <w:latentStyles w:defLockedState="0" w:defUIPriority="99" w:defSemiHidden="0" w:defUnhideWhenUsed="0" w:defQFormat="0" w:count="375">
     <w:lsdException w:name="Normal" w:uiPriority="0" w:qFormat="1"/>
     <w:lsdException w:name="heading 1" w:uiPriority="9" w:qFormat="1"/>
     <w:lsdException w:name="heading 2" w:semiHidden="1" w:uiPriority="9" w:unhideWhenUsed="1" w:qFormat="1"/>
@@ -364,7 +463,6 @@
     <w:lsdException w:name="HTML Sample" w:semiHidden="1" w:unhideWhenUsed="1"/>
     <w:lsdException w:name="HTML Typewriter" w:semiHidden="1" w:unhideWhenUsed="1"/>
     <w:lsdException w:name="HTML Variable" w:semiHidden="1" w:unhideWhenUsed="1"/>
-    <w:lsdException w:name="Normal Table" w:semiHidden="1" w:unhideWhenUsed="1"/>
     <w:lsdException w:name="annotation subject" w:semiHidden="1" w:unhideWhenUsed="1"/>
     <w:lsdException w:name="No List" w:semiHidden="1" w:unhideWhenUsed="1"/>
     <w:lsdException w:name="Outline List 1" w:semiHidden="1" w:unhideWhenUsed="1"/>
@@ -408,10 +506,8 @@
     <w:lsdException w:name="Table Elegant" w:semiHidden="1" w:unhideWhenUsed="1"/>
     <w:lsdException w:name="Table Professional" w:semiHidden="1" w:unhideWhenUsed="1"/>
     <w:lsdException w:name="Table Subtle 1" w:semiHidden="1" w:unhideWhenUsed="1"/>
-    <w:lsdException w:name="Table Subtle 2" w:semiHidden="1" w:unhideWhenUsed="1"/>
     <w:lsdException w:name="Table Web 1" w:semiHidden="1" w:unhideWhenUsed="1"/>
     <w:lsdException w:name="Table Web 2" w:semiHidden="1" w:unhideWhenUsed="1"/>
-    <w:lsdException w:name="Table Web 3" w:semiHidden="1" w:unhideWhenUsed="1"/>
     <w:lsdException w:name="Balloon Text" w:semiHidden="1" w:unhideWhenUsed="1"/>
     <w:lsdException w:name="Table Grid" w:uiPriority="39"/>
     <w:lsdException w:name="Table Theme" w:semiHidden="1" w:unhideWhenUsed="1"/>
@@ -630,18 +726,22 @@
     <w:lsdException w:name="List Table 5 Dark Accent 6" w:uiPriority="50"/>
     <w:lsdException w:name="List Table 6 Colorful Accent 6" w:uiPriority="51"/>
     <w:lsdException w:name="List Table 7 Colorful Accent 6" w:uiPriority="52"/>
+    <w:lsdException w:name="Mention" w:semiHidden="1" w:unhideWhenUsed="1"/>
+    <w:lsdException w:name="Smart Hyperlink" w:semiHidden="1" w:unhideWhenUsed="1"/>
+    <w:lsdException w:name="Hashtag" w:semiHidden="1" w:unhideWhenUsed="1"/>
+    <w:lsdException w:name="Unresolved Mention" w:semiHidden="1" w:unhideWhenUsed="1"/>
   </w:latentStyles>
-  <w:style w:type="paragraph" w:default="1" w:styleId="Normal">
+  <w:style w:type="paragraph" w:default="1" w:styleId="a">
     <w:name w:val="Normal"/>
     <w:qFormat/>
   </w:style>
-  <w:style w:type="character" w:default="1" w:styleId="DefaultParagraphFont">
+  <w:style w:type="character" w:default="1" w:styleId="a0">
     <w:name w:val="Default Paragraph Font"/>
     <w:uiPriority w:val="1"/>
     <w:semiHidden/>
     <w:unhideWhenUsed/>
   </w:style>
-  <w:style w:type="table" w:default="1" w:styleId="TableNormal">
+  <w:style w:type="table" w:default="1" w:styleId="a1">
     <w:name w:val="Normal Table"/>
     <w:uiPriority w:val="99"/>
     <w:semiHidden/>
@@ -656,15 +756,15 @@
       </w:tblCellMar>
     </w:tblPr>
   </w:style>
-  <w:style w:type="numbering" w:default="1" w:styleId="NoList">
+  <w:style w:type="numbering" w:default="1" w:styleId="a2">
     <w:name w:val="No List"/>
     <w:uiPriority w:val="99"/>
     <w:semiHidden/>
     <w:unhideWhenUsed/>
   </w:style>
-  <w:style w:type="paragraph" w:styleId="ListParagraph">
+  <w:style w:type="paragraph" w:styleId="a3">
     <w:name w:val="List Paragraph"/>
-    <w:basedOn w:val="Normal"/>
+    <w:basedOn w:val="a"/>
     <w:uiPriority w:val="34"/>
     <w:qFormat/>
     <w:rsid w:val="00CD0DFD"/>

</xml_diff>

<commit_message>
Some fixies in movieAbout. Getting to work site parsing and list of sources.
</commit_message>
<xml_diff>
--- a/Plan.docx
+++ b/Plan.docx
@@ -35,7 +35,12 @@
       </w:r>
       <w:proofErr w:type="spellEnd"/>
       <w:r>
-        <w:t xml:space="preserve"> дорам по выбору редакции. В верхней части экрана имеется </w:t>
+        <w:t xml:space="preserve"> дорам по выбору редакции. В верхней част</w:t>
+      </w:r>
+      <w:bookmarkStart w:id="0" w:name="_GoBack"/>
+      <w:bookmarkEnd w:id="0"/>
+      <w:r>
+        <w:t xml:space="preserve">и экрана имеется </w:t>
       </w:r>
       <w:proofErr w:type="spellStart"/>
       <w:r>
@@ -203,11 +208,108 @@
       <w:r>
         <w:t>. При выборе источника предлагается выбрать качество и плеер для воспроизведения.</w:t>
       </w:r>
-      <w:r>
-        <w:t>ß</w:t>
-      </w:r>
-      <w:bookmarkStart w:id="0" w:name="_GoBack"/>
-      <w:bookmarkEnd w:id="0"/>
+    </w:p>
+    <w:p>
+      <w:proofErr w:type="spellStart"/>
+      <w:r>
+        <w:t>Парсинг</w:t>
+      </w:r>
+      <w:proofErr w:type="spellEnd"/>
+      <w:r>
+        <w:t xml:space="preserve"> ресурсов:</w:t>
+      </w:r>
+    </w:p>
+    <w:p>
+      <w:r>
+        <w:t xml:space="preserve">Переход к </w:t>
+      </w:r>
+      <w:proofErr w:type="spellStart"/>
+      <w:r>
+        <w:t>дораме</w:t>
+      </w:r>
+      <w:proofErr w:type="spellEnd"/>
+      <w:r>
+        <w:t xml:space="preserve"> по ссылке + </w:t>
+      </w:r>
+      <w:r>
+        <w:t>/</w:t>
+      </w:r>
+      <w:r>
+        <w:rPr>
+          <w:lang w:val="en-US"/>
+        </w:rPr>
+        <w:t>series</w:t>
+      </w:r>
+      <w:r>
+        <w:t xml:space="preserve">1. </w:t>
+      </w:r>
+      <w:r>
+        <w:t xml:space="preserve">Взятие списка серий из по </w:t>
+      </w:r>
+      <w:r>
+        <w:rPr>
+          <w:lang w:val="en-US"/>
+        </w:rPr>
+        <w:t>id</w:t>
+      </w:r>
+      <w:r>
+        <w:t>=</w:t>
+      </w:r>
+      <w:proofErr w:type="spellStart"/>
+      <w:r>
+        <w:rPr>
+          <w:lang w:val="en-US"/>
+        </w:rPr>
+        <w:t>chapterSelectorSelect</w:t>
+      </w:r>
+      <w:proofErr w:type="spellEnd"/>
+      <w:r>
+        <w:t>.</w:t>
+      </w:r>
+    </w:p>
+    <w:p>
+      <w:r>
+        <w:t xml:space="preserve">После формирования листа с сериями для каждой серии выполняется переход с </w:t>
+      </w:r>
+      <w:proofErr w:type="spellStart"/>
+      <w:r>
+        <w:t>парсингом</w:t>
+      </w:r>
+      <w:proofErr w:type="spellEnd"/>
+      <w:r>
+        <w:t xml:space="preserve"> источников. Взять </w:t>
+      </w:r>
+      <w:r>
+        <w:rPr>
+          <w:lang w:val="en-US"/>
+        </w:rPr>
+        <w:t>div id=</w:t>
+      </w:r>
+      <w:proofErr w:type="spellStart"/>
+      <w:r>
+        <w:rPr>
+          <w:lang w:val="en-US"/>
+        </w:rPr>
+        <w:t>mangaBox</w:t>
+      </w:r>
+      <w:proofErr w:type="spellEnd"/>
+      <w:r>
+        <w:rPr>
+          <w:lang w:val="en-US"/>
+        </w:rPr>
+        <w:t xml:space="preserve">. </w:t>
+      </w:r>
+      <w:r>
+        <w:t xml:space="preserve">Оттуда из таблицы </w:t>
+      </w:r>
+      <w:proofErr w:type="spellStart"/>
+      <w:r>
+        <w:t>запарсить</w:t>
+      </w:r>
+      <w:proofErr w:type="spellEnd"/>
+      <w:r>
+        <w:t xml:space="preserve"> источники.</w:t>
+      </w:r>
     </w:p>
     <w:sectPr>
       <w:pgSz w:w="11906" w:h="16838"/>
@@ -463,6 +565,7 @@
     <w:lsdException w:name="HTML Sample" w:semiHidden="1" w:unhideWhenUsed="1"/>
     <w:lsdException w:name="HTML Typewriter" w:semiHidden="1" w:unhideWhenUsed="1"/>
     <w:lsdException w:name="HTML Variable" w:semiHidden="1" w:unhideWhenUsed="1"/>
+    <w:lsdException w:name="Normal Table" w:semiHidden="1" w:unhideWhenUsed="1"/>
     <w:lsdException w:name="annotation subject" w:semiHidden="1" w:unhideWhenUsed="1"/>
     <w:lsdException w:name="No List" w:semiHidden="1" w:unhideWhenUsed="1"/>
     <w:lsdException w:name="Outline List 1" w:semiHidden="1" w:unhideWhenUsed="1"/>
@@ -506,8 +609,10 @@
     <w:lsdException w:name="Table Elegant" w:semiHidden="1" w:unhideWhenUsed="1"/>
     <w:lsdException w:name="Table Professional" w:semiHidden="1" w:unhideWhenUsed="1"/>
     <w:lsdException w:name="Table Subtle 1" w:semiHidden="1" w:unhideWhenUsed="1"/>
+    <w:lsdException w:name="Table Subtle 2" w:semiHidden="1" w:unhideWhenUsed="1"/>
     <w:lsdException w:name="Table Web 1" w:semiHidden="1" w:unhideWhenUsed="1"/>
     <w:lsdException w:name="Table Web 2" w:semiHidden="1" w:unhideWhenUsed="1"/>
+    <w:lsdException w:name="Table Web 3" w:semiHidden="1" w:unhideWhenUsed="1"/>
     <w:lsdException w:name="Balloon Text" w:semiHidden="1" w:unhideWhenUsed="1"/>
     <w:lsdException w:name="Table Grid" w:uiPriority="39"/>
     <w:lsdException w:name="Table Theme" w:semiHidden="1" w:unhideWhenUsed="1"/>

</xml_diff>